<commit_message>
Implementa catálogo y carrito persistente
</commit_message>
<xml_diff>
--- a/1_requisitos/Historias de usuario y RF y RNF.docx
+++ b/1_requisitos/Historias de usuario y RF y RNF.docx
@@ -1,6 +1,6 @@
 
 <file path=word/document.xml><?xml version="1.0" encoding="utf-8"?>
-<w:document xmlns:wpc="http://schemas.microsoft.com/office/word/2010/wordprocessingCanvas" xmlns:cx="http://schemas.microsoft.com/office/drawing/2014/chartex" xmlns:cx1="http://schemas.microsoft.com/office/drawing/2015/9/8/chartex" xmlns:cx2="http://schemas.microsoft.com/office/drawing/2015/10/21/chartex" xmlns:cx3="http://schemas.microsoft.com/office/drawing/2016/5/9/chartex" xmlns:cx4="http://schemas.microsoft.com/office/drawing/2016/5/10/chartex" xmlns:cx5="http://schemas.microsoft.com/office/drawing/2016/5/11/chartex" xmlns:cx6="http://schemas.microsoft.com/office/drawing/2016/5/12/chartex" xmlns:cx7="http://schemas.microsoft.com/office/drawing/2016/5/13/chartex" xmlns:cx8="http://schemas.microsoft.com/office/drawing/2016/5/14/chartex" xmlns:mc="http://schemas.openxmlformats.org/markup-compatibility/2006" xmlns:aink="http://schemas.microsoft.com/office/drawing/2016/ink" xmlns:am3d="http://schemas.microsoft.com/office/drawing/2017/model3d" xmlns:o="urn:schemas-microsoft-com:office:office" xmlns:r="http://schemas.openxmlformats.org/officeDocument/2006/relationships" xmlns:m="http://schemas.openxmlformats.org/officeDocument/2006/math" xmlns:v="urn:schemas-microsoft-com:vml" xmlns:wp14="http://schemas.microsoft.com/office/word/2010/wordprocessingDrawing" xmlns:wp="http://schemas.openxmlformats.org/drawingml/2006/wordprocessingDrawing" xmlns:w10="urn:schemas-microsoft-com:office:word" xmlns:w="http://schemas.openxmlformats.org/wordprocessingml/2006/main" xmlns:w14="http://schemas.microsoft.com/office/word/2010/wordml" xmlns:w15="http://schemas.microsoft.com/office/word/2012/wordml" xmlns:w16cid="http://schemas.microsoft.com/office/word/2016/wordml/cid" xmlns:w16se="http://schemas.microsoft.com/office/word/2015/wordml/symex" xmlns:wpg="http://schemas.microsoft.com/office/word/2010/wordprocessingGroup" xmlns:wpi="http://schemas.microsoft.com/office/word/2010/wordprocessingInk" xmlns:wne="http://schemas.microsoft.com/office/word/2006/wordml" xmlns:wps="http://schemas.microsoft.com/office/word/2010/wordprocessingShape" mc:Ignorable="w14 w15 w16se w16cid wp14">
+<w:document xmlns:wpc="http://schemas.microsoft.com/office/word/2010/wordprocessingCanvas" xmlns:cx="http://schemas.microsoft.com/office/drawing/2014/chartex" xmlns:cx1="http://schemas.microsoft.com/office/drawing/2015/9/8/chartex" xmlns:mc="http://schemas.openxmlformats.org/markup-compatibility/2006" xmlns:o="urn:schemas-microsoft-com:office:office" xmlns:r="http://schemas.openxmlformats.org/officeDocument/2006/relationships" xmlns:m="http://schemas.openxmlformats.org/officeDocument/2006/math" xmlns:v="urn:schemas-microsoft-com:vml" xmlns:wp14="http://schemas.microsoft.com/office/word/2010/wordprocessingDrawing" xmlns:wp="http://schemas.openxmlformats.org/drawingml/2006/wordprocessingDrawing" xmlns:w10="urn:schemas-microsoft-com:office:word" xmlns:w="http://schemas.openxmlformats.org/wordprocessingml/2006/main" xmlns:w14="http://schemas.microsoft.com/office/word/2010/wordml" xmlns:w15="http://schemas.microsoft.com/office/word/2012/wordml" xmlns:w16se="http://schemas.microsoft.com/office/word/2015/wordml/symex" xmlns:wpg="http://schemas.microsoft.com/office/word/2010/wordprocessingGroup" xmlns:wpi="http://schemas.microsoft.com/office/word/2010/wordprocessingInk" xmlns:wne="http://schemas.microsoft.com/office/word/2006/wordml" xmlns:wps="http://schemas.microsoft.com/office/word/2010/wordprocessingShape" mc:Ignorable="w14 w15 w16se wp14">
   <w:body>
     <w:p>
       <w:pPr>
@@ -12,8 +12,6 @@
           <w:lang w:eastAsia="es-ES_tradnl"/>
         </w:rPr>
       </w:pPr>
-      <w:bookmarkStart w:id="0" w:name="_GoBack"/>
-      <w:bookmarkEnd w:id="0"/>
       <w:r>
         <w:rPr>
           <w:rFonts w:ascii="Times New Roman" w:eastAsia="Times New Roman" w:hAnsi="Times New Roman" w:cs="Times New Roman"/>
@@ -168,7 +166,7 @@
           <w:lang w:eastAsia="es-ES_tradnl"/>
         </w:rPr>
         <w:pict>
-          <v:rect id="_x0000_i1029" alt="" style="width:441.9pt;height:.05pt;mso-width-percent:0;mso-height-percent:0;mso-width-percent:0;mso-height-percent:0" o:hralign="center" o:hrstd="t" o:hr="t" fillcolor="#a0a0a0" stroked="f"/>
+          <v:rect id="_x0000_i1025" alt="" style="width:441.9pt;height:.05pt;mso-width-percent:0;mso-height-percent:0;mso-width-percent:0;mso-height-percent:0" o:hralign="center" o:hrstd="t" o:hr="t" fillcolor="#a0a0a0" stroked="f"/>
         </w:pict>
       </w:r>
     </w:p>
@@ -829,7 +827,7 @@
           <w:lang w:eastAsia="es-ES_tradnl"/>
         </w:rPr>
         <w:pict>
-          <v:rect id="_x0000_i1028" alt="" style="width:441.9pt;height:.05pt;mso-width-percent:0;mso-height-percent:0;mso-width-percent:0;mso-height-percent:0" o:hralign="center" o:hrstd="t" o:hr="t" fillcolor="#a0a0a0" stroked="f"/>
+          <v:rect id="_x0000_i1026" alt="" style="width:441.9pt;height:.05pt;mso-width-percent:0;mso-height-percent:0;mso-width-percent:0;mso-height-percent:0" o:hralign="center" o:hrstd="t" o:hr="t" fillcolor="#a0a0a0" stroked="f"/>
         </w:pict>
       </w:r>
     </w:p>
@@ -1236,7 +1234,30 @@
           <w:rFonts w:ascii="Times New Roman" w:eastAsia="Times New Roman" w:hAnsi="Times New Roman" w:cs="Times New Roman"/>
           <w:lang w:eastAsia="es-ES_tradnl"/>
         </w:rPr>
-        <w:t xml:space="preserve"> .</w:t>
+        <w:t xml:space="preserve"> </w:t>
+      </w:r>
+    </w:p>
+    <w:p>
+      <w:pPr>
+        <w:numPr>
+          <w:ilvl w:val="1"/>
+          <w:numId w:val="3"/>
+        </w:numPr>
+        <w:spacing w:before="100" w:beforeAutospacing="1" w:after="100" w:afterAutospacing="1"/>
+        <w:jc w:val="both"/>
+        <w:rPr>
+          <w:rFonts w:ascii="Times New Roman" w:eastAsia="Times New Roman" w:hAnsi="Times New Roman" w:cs="Times New Roman"/>
+          <w:lang w:eastAsia="es-ES_tradnl"/>
+        </w:rPr>
+      </w:pPr>
+      <w:bookmarkStart w:id="0" w:name="_GoBack"/>
+      <w:bookmarkEnd w:id="0"/>
+      <w:r>
+        <w:rPr>
+          <w:rFonts w:ascii="Times New Roman" w:eastAsia="Times New Roman" w:hAnsi="Times New Roman" w:cs="Times New Roman"/>
+          <w:lang w:eastAsia="es-ES_tradnl"/>
+        </w:rPr>
+        <w:t>.</w:t>
       </w:r>
     </w:p>
     <w:p>
@@ -2697,7 +2718,7 @@
           <w:lang w:eastAsia="es-ES_tradnl"/>
         </w:rPr>
         <w:pict>
-          <v:rect id="_x0000_i1026" alt="" style="width:441.9pt;height:.05pt;mso-width-percent:0;mso-height-percent:0;mso-width-percent:0;mso-height-percent:0" o:hralign="center" o:hrstd="t" o:hr="t" fillcolor="#a0a0a0" stroked="f"/>
+          <v:rect id="_x0000_i1028" alt="" style="width:441.9pt;height:.05pt;mso-width-percent:0;mso-height-percent:0;mso-width-percent:0;mso-height-percent:0" o:hralign="center" o:hrstd="t" o:hr="t" fillcolor="#a0a0a0" stroked="f"/>
         </w:pict>
       </w:r>
     </w:p>
@@ -3451,7 +3472,7 @@
           <w:lang w:eastAsia="es-ES_tradnl"/>
         </w:rPr>
         <w:pict>
-          <v:rect id="_x0000_i1025" alt="" style="width:441.9pt;height:.05pt;mso-width-percent:0;mso-height-percent:0;mso-width-percent:0;mso-height-percent:0" o:hralign="center" o:hrstd="t" o:hr="t" fillcolor="#a0a0a0" stroked="f"/>
+          <v:rect id="_x0000_i1029" alt="" style="width:441.9pt;height:.05pt;mso-width-percent:0;mso-height-percent:0;mso-width-percent:0;mso-height-percent:0" o:hralign="center" o:hrstd="t" o:hr="t" fillcolor="#a0a0a0" stroked="f"/>
         </w:pict>
       </w:r>
     </w:p>
@@ -3839,7 +3860,7 @@
 </file>
 
 <file path=word/numbering.xml><?xml version="1.0" encoding="utf-8"?>
-<w:numbering xmlns:wpc="http://schemas.microsoft.com/office/word/2010/wordprocessingCanvas" xmlns:cx="http://schemas.microsoft.com/office/drawing/2014/chartex" xmlns:cx1="http://schemas.microsoft.com/office/drawing/2015/9/8/chartex" xmlns:cx2="http://schemas.microsoft.com/office/drawing/2015/10/21/chartex" xmlns:cx3="http://schemas.microsoft.com/office/drawing/2016/5/9/chartex" xmlns:cx4="http://schemas.microsoft.com/office/drawing/2016/5/10/chartex" xmlns:cx5="http://schemas.microsoft.com/office/drawing/2016/5/11/chartex" xmlns:cx6="http://schemas.microsoft.com/office/drawing/2016/5/12/chartex" xmlns:cx7="http://schemas.microsoft.com/office/drawing/2016/5/13/chartex" xmlns:cx8="http://schemas.microsoft.com/office/drawing/2016/5/14/chartex" xmlns:mc="http://schemas.openxmlformats.org/markup-compatibility/2006" xmlns:aink="http://schemas.microsoft.com/office/drawing/2016/ink" xmlns:am3d="http://schemas.microsoft.com/office/drawing/2017/model3d" xmlns:o="urn:schemas-microsoft-com:office:office" xmlns:r="http://schemas.openxmlformats.org/officeDocument/2006/relationships" xmlns:m="http://schemas.openxmlformats.org/officeDocument/2006/math" xmlns:v="urn:schemas-microsoft-com:vml" xmlns:wp14="http://schemas.microsoft.com/office/word/2010/wordprocessingDrawing" xmlns:wp="http://schemas.openxmlformats.org/drawingml/2006/wordprocessingDrawing" xmlns:w10="urn:schemas-microsoft-com:office:word" xmlns:w="http://schemas.openxmlformats.org/wordprocessingml/2006/main" xmlns:w14="http://schemas.microsoft.com/office/word/2010/wordml" xmlns:w15="http://schemas.microsoft.com/office/word/2012/wordml" xmlns:w16cid="http://schemas.microsoft.com/office/word/2016/wordml/cid" xmlns:w16se="http://schemas.microsoft.com/office/word/2015/wordml/symex" xmlns:wpg="http://schemas.microsoft.com/office/word/2010/wordprocessingGroup" xmlns:wpi="http://schemas.microsoft.com/office/word/2010/wordprocessingInk" xmlns:wne="http://schemas.microsoft.com/office/word/2006/wordml" xmlns:wps="http://schemas.microsoft.com/office/word/2010/wordprocessingShape" mc:Ignorable="w14 w15 w16se w16cid wp14">
+<w:numbering xmlns:wpc="http://schemas.microsoft.com/office/word/2010/wordprocessingCanvas" xmlns:cx="http://schemas.microsoft.com/office/drawing/2014/chartex" xmlns:cx1="http://schemas.microsoft.com/office/drawing/2015/9/8/chartex" xmlns:mc="http://schemas.openxmlformats.org/markup-compatibility/2006" xmlns:o="urn:schemas-microsoft-com:office:office" xmlns:r="http://schemas.openxmlformats.org/officeDocument/2006/relationships" xmlns:m="http://schemas.openxmlformats.org/officeDocument/2006/math" xmlns:v="urn:schemas-microsoft-com:vml" xmlns:wp14="http://schemas.microsoft.com/office/word/2010/wordprocessingDrawing" xmlns:wp="http://schemas.openxmlformats.org/drawingml/2006/wordprocessingDrawing" xmlns:w10="urn:schemas-microsoft-com:office:word" xmlns:w="http://schemas.openxmlformats.org/wordprocessingml/2006/main" xmlns:w14="http://schemas.microsoft.com/office/word/2010/wordml" xmlns:w15="http://schemas.microsoft.com/office/word/2012/wordml" xmlns:w16se="http://schemas.microsoft.com/office/word/2015/wordml/symex" xmlns:wpg="http://schemas.microsoft.com/office/word/2010/wordprocessingGroup" xmlns:wpi="http://schemas.microsoft.com/office/word/2010/wordprocessingInk" xmlns:wne="http://schemas.microsoft.com/office/word/2006/wordml" xmlns:wps="http://schemas.microsoft.com/office/word/2010/wordprocessingShape" mc:Ignorable="w14 w15 w16se wp14">
   <w:abstractNum w:abstractNumId="0" w15:restartNumberingAfterBreak="0">
     <w:nsid w:val="01F71A8F"/>
     <w:multiLevelType w:val="multilevel"/>
@@ -5904,7 +5925,7 @@
 </file>
 
 <file path=word/styles.xml><?xml version="1.0" encoding="utf-8"?>
-<w:styles xmlns:mc="http://schemas.openxmlformats.org/markup-compatibility/2006" xmlns:r="http://schemas.openxmlformats.org/officeDocument/2006/relationships" xmlns:w="http://schemas.openxmlformats.org/wordprocessingml/2006/main" xmlns:w14="http://schemas.microsoft.com/office/word/2010/wordml" xmlns:w15="http://schemas.microsoft.com/office/word/2012/wordml" xmlns:w16cid="http://schemas.microsoft.com/office/word/2016/wordml/cid" xmlns:w16se="http://schemas.microsoft.com/office/word/2015/wordml/symex" mc:Ignorable="w14 w15 w16se w16cid">
+<w:styles xmlns:mc="http://schemas.openxmlformats.org/markup-compatibility/2006" xmlns:r="http://schemas.openxmlformats.org/officeDocument/2006/relationships" xmlns:w="http://schemas.openxmlformats.org/wordprocessingml/2006/main" xmlns:w14="http://schemas.microsoft.com/office/word/2010/wordml" xmlns:w15="http://schemas.microsoft.com/office/word/2012/wordml" xmlns:w16se="http://schemas.microsoft.com/office/word/2015/wordml/symex" mc:Ignorable="w14 w15 w16se">
   <w:docDefaults>
     <w:rPrDefault>
       <w:rPr>
@@ -5916,7 +5937,7 @@
     </w:rPrDefault>
     <w:pPrDefault/>
   </w:docDefaults>
-  <w:latentStyles w:defLockedState="0" w:defUIPriority="99" w:defSemiHidden="0" w:defUnhideWhenUsed="0" w:defQFormat="0" w:count="375">
+  <w:latentStyles w:defLockedState="0" w:defUIPriority="99" w:defSemiHidden="0" w:defUnhideWhenUsed="0" w:defQFormat="0" w:count="371">
     <w:lsdException w:name="Normal" w:uiPriority="0" w:qFormat="1"/>
     <w:lsdException w:name="heading 1" w:uiPriority="9" w:qFormat="1"/>
     <w:lsdException w:name="heading 2" w:semiHidden="1" w:uiPriority="9" w:unhideWhenUsed="1" w:qFormat="1"/>
@@ -6288,10 +6309,6 @@
     <w:lsdException w:name="List Table 5 Dark Accent 6" w:uiPriority="50"/>
     <w:lsdException w:name="List Table 6 Colorful Accent 6" w:uiPriority="51"/>
     <w:lsdException w:name="List Table 7 Colorful Accent 6" w:uiPriority="52"/>
-    <w:lsdException w:name="Mention" w:semiHidden="1" w:unhideWhenUsed="1"/>
-    <w:lsdException w:name="Smart Hyperlink" w:semiHidden="1" w:unhideWhenUsed="1"/>
-    <w:lsdException w:name="Hashtag" w:semiHidden="1" w:unhideWhenUsed="1"/>
-    <w:lsdException w:name="Unresolved Mention" w:semiHidden="1" w:unhideWhenUsed="1"/>
   </w:latentStyles>
   <w:style w:type="paragraph" w:default="1" w:styleId="Normal">
     <w:name w:val="Normal"/>

</xml_diff>